<commit_message>
Draft_055: add assertive-core legend note for unhedged grey
</commit_message>
<xml_diff>
--- a/thesis/003_ThesisProposal_Draft_055.docx
+++ b/thesis/003_ThesisProposal_Draft_055.docx
@@ -19795,7 +19795,7 @@
           <w:szCs w:val="22"/>
           <w:rtl w:val="0"/>
         </w:rPr>
-        <w:t>• Unhedged sites: claim clauses with no hedge. Reverse test: a hedge could be inserted without changing the facts. Procedural statements never markable. Example: “Results showed X” → could be “Results suggested X.”</w:t>
+        <w:t>Grey highlight marks the assertive core of the unhedged site; the full clause is recorded in the coding sheet. • Unhedged sites: claim clauses with no hedge. Reverse test: a hedge could be inserted without changing the facts. Procedural statements never markable. Example: “Results showed X” → could be “Results suggested X.”</w:t>
       </w:r>
       <w:r>
         <w:rPr>
@@ -21366,6 +21366,19 @@
     </w:p>
     <w:p>
       <w:pPr>
+        <w:spacing w:before="120" w:after="120" w:line="480" w:lineRule="auto"/>
+      </w:pPr>
+      <w:r>
+        <w:rPr>
+          <w:rFonts w:ascii="Georgia" w:hAnsi="Georgia" w:cs="Georgia" w:eastAsia="Georgia"/>
+          <w:sz w:val="22"/>
+          <w:i/>
+        </w:rPr>
+        <w:t xml:space="preserve">Note. Grey highlight on unhedged sites marks the assertive core only. The full clause is recorded in the coding sheet.</w:t>
+      </w:r>
+    </w:p>
+    <w:p>
+      <w:pPr>
         <w:spacing w:before="240" w:after="0" w:line="480" w:lineRule="auto"/>
         <w:jc w:val="center"/>
         <w:rPr/>
@@ -21697,19 +21710,7 @@
           <w:strike w:val="0"/>
           <w:color w:val="000000"/>
         </w:rPr>
-        <w:t xml:space="preserve"> of Balitbitan on Mueller Hinton Agar. The treatment evaluated as follows: T1 (Balitbitan extract in Methanol), T2 (Balitbitan extract in Hexane) and T3 (Balitbitan extract in DCM). </w:t>
-      </w:r>
-      <w:r>
-        <w:rPr>
-          <w:rFonts w:ascii="Georgia" w:hAnsi="Georgia" w:cs="Georgia" w:eastAsia="Georgia"/>
-          <w:sz w:val="22"/>
-          <w:szCs w:val="22"/>
-          <w:b w:val="0"/>
-          <w:bCs w:val="0"/>
-          <w:strike w:val="0"/>
-          <w:color w:val="000000"/>
-        </w:rPr>
-        <w:t xml:space="preserve">The result of antibacterial testing revealed that </w:t>
+        <w:t xml:space="preserve"> of Balitbitan on Mueller Hinton Agar. The treatment evaluated as follows: T1 (Balitbitan extract in Methanol), T2 (Balitbitan extract in Hexane) and T3 (Balitbitan extract in DCM). The result of antibacterial testing revealed that </w:t>
       </w:r>
       <w:r>
         <w:rPr>
@@ -22352,19 +22353,7 @@
           <w:strike w:val="0"/>
           <w:color w:val="000000"/>
         </w:rPr>
-        <w:t xml:space="preserve"> be on developing and optimizing eco-bricks using a mixture of SUPs and UCO developed through trial and error. SUPs recovered from various donors from the [REDACTED] and UCO. The preliminary trials established that molding faces some difficulty with increased ratios of UCO to SUPs. Thus, in the optimization process, varying ratios of UCO was used, starting with UCO to SUPs 1:1 as treatment 1, a decreasing ratio of UCO to SUPs. At equal parts by weight of UCO and SUPs, optimization started at Treatment 1 with a 1:1 ratio. Treatments 2–5 proceeded similarly, increasing the ratio of UCO to SUPs. Density measurements, water absorption, and drop tests were all performed and observed. A self-testing protocol based on current literature was used. The density was calculated relative to mass and volume; however, the water absorption test yielded inconsistent findings. </w:t>
-      </w:r>
-      <w:r>
-        <w:rPr>
-          <w:rFonts w:ascii="Georgia" w:hAnsi="Georgia" w:cs="Georgia" w:eastAsia="Georgia"/>
-          <w:sz w:val="22"/>
-          <w:szCs w:val="22"/>
-          <w:b w:val="0"/>
-          <w:bCs w:val="0"/>
-          <w:strike w:val="0"/>
-          <w:color w:val="000000"/>
-        </w:rPr>
-        <w:t xml:space="preserve">A drop test was also performed, which revealed that </w:t>
+        <w:t xml:space="preserve"> be on developing and optimizing eco-bricks using a mixture of SUPs and UCO developed through trial and error. SUPs recovered from various donors from the [REDACTED] and UCO. The preliminary trials established that molding faces some difficulty with increased ratios of UCO to SUPs. Thus, in the optimization process, varying ratios of UCO was used, starting with UCO to SUPs 1:1 as treatment 1, a decreasing ratio of UCO to SUPs. At equal parts by weight of UCO and SUPs, optimization started at Treatment 1 with a 1:1 ratio. Treatments 2–5 proceeded similarly, increasing the ratio of UCO to SUPs. Density measurements, water absorption, and drop tests were all performed and observed. A self-testing protocol based on current literature was used. The density was calculated relative to mass and volume; however, the water absorption test yielded inconsistent findings. A drop test was also performed, which revealed that </w:t>
       </w:r>
       <w:r>
         <w:rPr>
@@ -22939,19 +22928,7 @@
           <w:strike w:val="0"/>
           <w:color w:val="000000"/>
         </w:rPr>
-        <w:t xml:space="preserve"> However, heart did not show any significant effect (lesion / aberration) to its cytoarchitecture. Interestingly, all histopathological observation under the combined treatments of Z. talanai and L-Taurine, Z. talanai and monosodium glutamate showed a significant reduction of lesions / aberrations score to the liver and kidney compare to the pure treatments. However, the heart didn’t respond or show any significant changes regardless of the treatment. </w:t>
-      </w:r>
-      <w:r>
-        <w:rPr>
-          <w:rFonts w:ascii="Georgia" w:hAnsi="Georgia" w:cs="Georgia" w:eastAsia="Georgia"/>
-          <w:sz w:val="22"/>
-          <w:szCs w:val="22"/>
-          <w:b w:val="0"/>
-          <w:bCs w:val="0"/>
-          <w:strike w:val="0"/>
-          <w:color w:val="000000"/>
-        </w:rPr>
-        <w:t xml:space="preserve">Based on the results of this study, </w:t>
+        <w:t xml:space="preserve"> However, heart did not show any significant effect (lesion / aberration) to its cytoarchitecture. Interestingly, all histopathological observation under the combined treatments of Z. talanai and L-Taurine, Z. talanai and monosodium glutamate showed a significant reduction of lesions / aberrations score to the liver and kidney compare to the pure treatments. However, the heart didn’t respond or show any significant changes regardless of the treatment. Based on the results of this study, </w:t>
       </w:r>
       <w:r>
         <w:rPr>
@@ -23224,19 +23201,7 @@
           <w:strike w:val="0"/>
           <w:color w:val="000000"/>
         </w:rPr>
-        <w:t xml:space="preserve"> mycobacterial infections in cultivated milkfish collected from fish-supplying areas of [REDACTED]. </w:t>
-      </w:r>
-      <w:r>
-        <w:rPr>
-          <w:rFonts w:ascii="Georgia" w:hAnsi="Georgia" w:cs="Georgia" w:eastAsia="Georgia"/>
-          <w:sz w:val="22"/>
-          <w:szCs w:val="22"/>
-          <w:b w:val="0"/>
-          <w:bCs w:val="0"/>
-          <w:strike w:val="0"/>
-          <w:color w:val="000000"/>
-        </w:rPr>
-        <w:t xml:space="preserve">Using the Ziehl-Neelsen stain for acid-fast bacteria detection, along with biochemical testing methods such as the catalase test and assessing growth in the presence of the Salt Tolerance Test, </w:t>
+        <w:t xml:space="preserve"> mycobacterial infections in cultivated milkfish collected from fish-supplying areas of [REDACTED]. Using the Ziehl-Neelsen stain for acid-fast bacteria detection, along with biochemical testing methods such as the catalase test and assessing growth in the presence of the Salt Tolerance Test, </w:t>
       </w:r>
       <w:r>
         <w:rPr>
@@ -23273,19 +23238,7 @@
           <w:strike w:val="0"/>
           <w:color w:val="000000"/>
         </w:rPr>
-        <w:t xml:space="preserve"> Additionally, biochemical testing, specifically the catalase test, was utilized to identify the catalase enzyme activity characteristic of mycobacteria, catalase test positive shows the result of the formation of bubbles. Furthermore, the growth of mycobacteria in the presence of the Salt Tolerance Test was assessed, showing the ability of these bacteria to thrive in high-salt environments, which is crucial information for understanding their survival and spread in aquaculture settings. </w:t>
-      </w:r>
-      <w:r>
-        <w:rPr>
-          <w:rFonts w:ascii="Georgia" w:hAnsi="Georgia" w:cs="Georgia" w:eastAsia="Georgia"/>
-          <w:sz w:val="22"/>
-          <w:szCs w:val="22"/>
-          <w:b w:val="0"/>
-          <w:bCs w:val="0"/>
-          <w:strike w:val="0"/>
-          <w:color w:val="000000"/>
-        </w:rPr>
-        <w:t xml:space="preserve">Overall, </w:t>
+        <w:t xml:space="preserve"> Additionally, biochemical testing, specifically the catalase test, was utilized to identify the catalase enzyme activity characteristic of mycobacteria, catalase test positive shows the result of the formation of bubbles. Furthermore, the growth of mycobacteria in the presence of the Salt Tolerance Test was assessed, showing the ability of these bacteria to thrive in high-salt environments, which is crucial information for understanding their survival and spread in aquaculture settings. Overall, </w:t>
       </w:r>
       <w:r>
         <w:rPr>
@@ -25219,19 +25172,7 @@
           <w:strike w:val="0"/>
           <w:color w:val="000000"/>
         </w:rPr>
-        <w:t xml:space="preserve">This study assessed the profiling, occurrence and antibiotic resistance of Escherichia coli and Salmonella spp., in retail chicken eggs sold in [REDACTED]. The study aimed to profile handling practices of egg vendors, detect E. coli and Salmonella spp. on retail chicken eggs sold in [REDACTED] and assess the degree of antibiotic susceptibility of the bacterial isolates. A total of 16 vendors were evaluated on their egg handling practices, evaluated using a survey checklist, focusing on the assessment of demographic profile and their egg handling practices aligned with the Code of Hygienic Practice for Eggs and Egg Products. For the detection of E. coli and Salmonella spp. isolates, a total of 36 samples were collected, comprised of 16 eggshell surface samples and 16 egg content sample. Samples were subjected to selective culture media, biochemical tests and antibiotic sensitivity testing of bacterial isolates. None of the samples tested positive for Salmonella spp. However, 19% of egg samples tested positive for E. coli on eosin methylene blue (EMB) agar, characterized by green metallic sheen colonies. The 6% of positive samples were detected on the egg shell surface, while 13% of isolated E. coli were located on the egg’s homogenized yolk and albumen. Antibiotic sensitivity testing using disk diffusion method following CLSI guidelines revealed 100% resistance to chloramphenicol, tetracycline, and streptomycin. While 33% showed resistance to meropenem. </w:t>
-      </w:r>
-      <w:r>
-        <w:rPr>
-          <w:rFonts w:ascii="Georgia" w:hAnsi="Georgia" w:cs="Georgia" w:eastAsia="Georgia"/>
-          <w:sz w:val="22"/>
-          <w:szCs w:val="22"/>
-          <w:b w:val="0"/>
-          <w:bCs w:val="0"/>
-          <w:strike w:val="0"/>
-          <w:color w:val="000000"/>
-        </w:rPr>
-        <w:t xml:space="preserve">On the other hand, </w:t>
+        <w:t xml:space="preserve">This study assessed the profiling, occurrence and antibiotic resistance of Escherichia coli and Salmonella spp., in retail chicken eggs sold in [REDACTED]. The study aimed to profile handling practices of egg vendors, detect E. coli and Salmonella spp. on retail chicken eggs sold in [REDACTED] and assess the degree of antibiotic susceptibility of the bacterial isolates. A total of 16 vendors were evaluated on their egg handling practices, evaluated using a survey checklist, focusing on the assessment of demographic profile and their egg handling practices aligned with the Code of Hygienic Practice for Eggs and Egg Products. For the detection of E. coli and Salmonella spp. isolates, a total of 36 samples were collected, comprised of 16 eggshell surface samples and 16 egg content sample. Samples were subjected to selective culture media, biochemical tests and antibiotic sensitivity testing of bacterial isolates. None of the samples tested positive for Salmonella spp. However, 19% of egg samples tested positive for E. coli on eosin methylene blue (EMB) agar, characterized by green metallic sheen colonies. The 6% of positive samples were detected on the egg shell surface, while 13% of isolated E. coli were located on the egg’s homogenized yolk and albumen. Antibiotic sensitivity testing using disk diffusion method following CLSI guidelines revealed 100% resistance to chloramphenicol, tetracycline, and streptomycin. While 33% showed resistance to meropenem. On the other hand, </w:t>
       </w:r>
       <w:r>
         <w:rPr>
@@ -25349,19 +25290,7 @@
           <w:strike w:val="0"/>
           <w:color w:val="000000"/>
         </w:rPr>
-        <w:t xml:space="preserve">The Escherichia coli and Campylobacter jejuni are two of the foodborne pathogens affecting public health around the world. A cross-sectional bacteriological study was conducted from January to February 2025 in [REDACTED]. This study presents the bacteriological analysis of E. coli and C. jejuni from 12 raw buffalo milk samples from 12 vendors. Data were gathered from vendors through modified and patterned questionnaires to assess demographics and hygiene practices of vendors. </w:t>
-      </w:r>
-      <w:r>
-        <w:rPr>
-          <w:rFonts w:ascii="Georgia" w:hAnsi="Georgia" w:cs="Georgia" w:eastAsia="Georgia"/>
-          <w:sz w:val="22"/>
-          <w:szCs w:val="22"/>
-          <w:b w:val="0"/>
-          <w:bCs w:val="0"/>
-          <w:strike w:val="0"/>
-          <w:color w:val="000000"/>
-        </w:rPr>
-        <w:t xml:space="preserve">Results indicated that </w:t>
+        <w:t xml:space="preserve">The Escherichia coli and Campylobacter jejuni are two of the foodborne pathogens affecting public health around the world. A cross-sectional bacteriological study was conducted from January to February 2025 in [REDACTED]. This study presents the bacteriological analysis of E. coli and C. jejuni from 12 raw buffalo milk samples from 12 vendors. Data were gathered from vendors through modified and patterned questionnaires to assess demographics and hygiene practices of vendors. Results indicated that </w:t>
       </w:r>
       <w:r>
         <w:rPr>
@@ -26654,19 +26583,7 @@
           <w:strike w:val="0"/>
           <w:color w:val="000000"/>
         </w:rPr>
-        <w:t xml:space="preserve">Noni (Morinda citrifolia) is recognized to have a wide range of therapeutic use including illnesses like inflammation, back pain, diabetes, hypertension, cancer, joint problems, and skin allergies. Adding to these arrays of claims, this study was conducted to determine the wound healing efficacy of Noni fruit ethanolic extract and its antimicrobial activity against Staphylococcus aureus strain ATCC 29213. The agar well diffusion method was done to determine the concentration of Noni ethanolic extract yielding the highest zone of inhibition. The treatment were as follows: Treatment 1 (T1) with 40% concentration Noni extract; Treatment 2 (T2) with 20% concentration noni extract; Treatment 3 (T3) with 10% concentration Noni extract; a positive control with 2% Mupirocin; and a negative control with pure petroleum jelly. </w:t>
-      </w:r>
-      <w:r>
-        <w:rPr>
-          <w:rFonts w:ascii="Georgia" w:hAnsi="Georgia" w:cs="Georgia" w:eastAsia="Georgia"/>
-          <w:sz w:val="22"/>
-          <w:szCs w:val="22"/>
-          <w:b w:val="0"/>
-          <w:bCs w:val="0"/>
-          <w:strike w:val="0"/>
-          <w:color w:val="000000"/>
-        </w:rPr>
-        <w:t xml:space="preserve">Results revealed that </w:t>
+        <w:t xml:space="preserve">Noni (Morinda citrifolia) is recognized to have a wide range of therapeutic use including illnesses like inflammation, back pain, diabetes, hypertension, cancer, joint problems, and skin allergies. Adding to these arrays of claims, this study was conducted to determine the wound healing efficacy of Noni fruit ethanolic extract and its antimicrobial activity against Staphylococcus aureus strain ATCC 29213. The agar well diffusion method was done to determine the concentration of Noni ethanolic extract yielding the highest zone of inhibition. The treatment were as follows: Treatment 1 (T1) with 40% concentration Noni extract; Treatment 2 (T2) with 20% concentration noni extract; Treatment 3 (T3) with 10% concentration Noni extract; a positive control with 2% Mupirocin; and a negative control with pure petroleum jelly. Results revealed that </w:t>
       </w:r>
       <w:r>
         <w:rPr>
@@ -26703,19 +26620,7 @@
           <w:strike w:val="0"/>
           <w:color w:val="000000"/>
         </w:rPr>
-        <w:t xml:space="preserve"> The 40% Noni concentration was used in the in vivo part of the experiment. A total of nine male albino mice were used to test the antibacterial activity of three different treatments given once a day for seven days. Treatment 1 was the 40% concentration of Noni ethanolic extract, T2 was the positive control with 2% Mupirocin (Mupisaph®) and T3 was the negative control with pure petroleum jelly. The results showed that applying 40% Noni ethanolic extract and 2% Mupirocin ointment exhibited a faster wound closure in vivo though not significantly different. </w:t>
-      </w:r>
-      <w:r>
-        <w:rPr>
-          <w:rFonts w:ascii="Georgia" w:hAnsi="Georgia" w:cs="Georgia" w:eastAsia="Georgia"/>
-          <w:sz w:val="22"/>
-          <w:szCs w:val="22"/>
-          <w:b w:val="0"/>
-          <w:bCs w:val="0"/>
-          <w:strike w:val="0"/>
-          <w:color w:val="000000"/>
-        </w:rPr>
-        <w:t xml:space="preserve">With the in vitro and in vivo results, </w:t>
+        <w:t xml:space="preserve"> The 40% Noni concentration was used in the in vivo part of the experiment. A total of nine male albino mice were used to test the antibacterial activity of three different treatments given once a day for seven days. Treatment 1 was the 40% concentration of Noni ethanolic extract, T2 was the positive control with 2% Mupirocin (Mupisaph®) and T3 was the negative control with pure petroleum jelly. The results showed that applying 40% Noni ethanolic extract and 2% Mupirocin ointment exhibited a faster wound closure in vivo though not significantly different. With the in vitro and in vivo results, </w:t>
       </w:r>
       <w:r>
         <w:rPr>
@@ -26940,19 +26845,7 @@
           <w:strike w:val="0"/>
           <w:color w:val="000000"/>
         </w:rPr>
-        <w:t xml:space="preserve"> The dog owners were very aware of rabies (mean=3.74) and leptospirosis (mean=3.73); while moderate awareness was found on toxocariasis and ancylostomiasis (mean=3.01), scabies (mean=3.05), and dermatophytosis (mean=2.96), The internet (38.3%) and veterinarians (36%) were the primary sources of information on canine zoonotic diseases. </w:t>
-      </w:r>
-      <w:r>
-        <w:rPr>
-          <w:rFonts w:ascii="Georgia" w:hAnsi="Georgia" w:cs="Georgia" w:eastAsia="Georgia"/>
-          <w:sz w:val="22"/>
-          <w:szCs w:val="22"/>
-          <w:b w:val="0"/>
-          <w:bCs w:val="0"/>
-          <w:strike w:val="0"/>
-          <w:color w:val="000000"/>
-        </w:rPr>
-        <w:t xml:space="preserve">Using Pearson’s correlation, </w:t>
+        <w:t xml:space="preserve"> The dog owners were very aware of rabies (mean=3.74) and leptospirosis (mean=3.73); while moderate awareness was found on toxocariasis and ancylostomiasis (mean=3.01), scabies (mean=3.05), and dermatophytosis (mean=2.96), The internet (38.3%) and veterinarians (36%) were the primary sources of information on canine zoonotic diseases. Using Pearson’s correlation, </w:t>
       </w:r>
       <w:r>
         <w:rPr>
@@ -27067,19 +26960,7 @@
           <w:strike w:val="0"/>
           <w:color w:val="000000"/>
         </w:rPr>
-        <w:t xml:space="preserve">This study evaluated the knowledge, attitudes, and practices (KAP) of Pandi, Bulacan, Philippines residents regarding rabies, a fatal viral zoonotic disease posing significant public health risks. A cross-sectional survey was conducted among 384 respondents using structured questionnaires to assess awareness, perceptions, and preventive measures against rabies. Statistical analyses, including Chi-square tests and multiple linear regression, were employed to examine associations between socio-demographic factors and KAP scores and predictive relationships among knowledge, attitudes, and practices of respondents. </w:t>
-      </w:r>
-      <w:r>
-        <w:rPr>
-          <w:rFonts w:ascii="Georgia" w:hAnsi="Georgia" w:cs="Georgia" w:eastAsia="Georgia"/>
-          <w:sz w:val="22"/>
-          <w:szCs w:val="22"/>
-          <w:b w:val="0"/>
-          <w:bCs w:val="0"/>
-          <w:strike w:val="0"/>
-          <w:color w:val="000000"/>
-        </w:rPr>
-        <w:t xml:space="preserve">The results indicated that </w:t>
+        <w:t xml:space="preserve">This study evaluated the knowledge, attitudes, and practices (KAP) of Pandi, Bulacan, Philippines residents regarding rabies, a fatal viral zoonotic disease posing significant public health risks. A cross-sectional survey was conducted among 384 respondents using structured questionnaires to assess awareness, perceptions, and preventive measures against rabies. Statistical analyses, including Chi-square tests and multiple linear regression, were employed to examine associations between socio-demographic factors and KAP scores and predictive relationships among knowledge, attitudes, and practices of respondents. The results indicated that </w:t>
       </w:r>
       <w:r>
         <w:rPr>
@@ -27116,19 +26997,7 @@
           <w:strike w:val="0"/>
           <w:color w:val="000000"/>
         </w:rPr>
-        <w:t xml:space="preserve"> Attitudes toward rabies prevention were predominantly positive (77%), as were reported practices (97%). Significant associations were identified between knowledge levels and socio-demographic factors, including educational attainment (p=0.0008), where higher education correlated with improved rabies awareness and pet ownership practices (p=0.035). For attitudes, significant associations were observed between respondents’ age (p=0.015) and educational attainment (p&lt;0.0001). Practices showed only one significant association with educational attainment (p=0.016). </w:t>
-      </w:r>
-      <w:r>
-        <w:rPr>
-          <w:rFonts w:ascii="Georgia" w:hAnsi="Georgia" w:cs="Georgia" w:eastAsia="Georgia"/>
-          <w:sz w:val="22"/>
-          <w:szCs w:val="22"/>
-          <w:b w:val="0"/>
-          <w:bCs w:val="0"/>
-          <w:strike w:val="0"/>
-          <w:color w:val="000000"/>
-        </w:rPr>
-        <w:t xml:space="preserve">Multiple linear regression analysis confirmed interrelationships among KAP dimensions, revealing that </w:t>
+        <w:t xml:space="preserve"> Attitudes toward rabies prevention were predominantly positive (77%), as were reported practices (97%). Significant associations were identified between knowledge levels and socio-demographic factors, including educational attainment (p=0.0008), where higher education correlated with improved rabies awareness and pet ownership practices (p=0.035). For attitudes, significant associations were observed between respondents’ age (p=0.015) and educational attainment (p&lt;0.0001). Practices showed only one significant association with educational attainment (p=0.016). Multiple linear regression analysis confirmed interrelationships among KAP dimensions, revealing that </w:t>
       </w:r>
       <w:r>
         <w:rPr>
@@ -28324,19 +28193,7 @@
           <w:strike w:val="0"/>
           <w:color w:val="000000"/>
         </w:rPr>
-        <w:t xml:space="preserve">The study on the performance of eggplant applied with different methods of Kuhol Amino Acid Application was conducted at [REDACTED], from December 2024 to March 2024 . The Mucho F1 eggplant variety was used as an experimental crop in the study. The experiment was laid out following Randomized Complete Block Design (RCBD) with three replications and four treatments, namely: T1 – Negative Control T2 – Foliar Application of Kuhol Amino Acid; T3 – Drenching Application of Kuhol Amino Acid; T4 – Inorganic Fertilizer (RR). </w:t>
-      </w:r>
-      <w:r>
-        <w:rPr>
-          <w:rFonts w:ascii="Georgia" w:hAnsi="Georgia" w:cs="Georgia" w:eastAsia="Georgia"/>
-          <w:sz w:val="22"/>
-          <w:szCs w:val="22"/>
-          <w:b w:val="0"/>
-          <w:bCs w:val="0"/>
-          <w:strike w:val="0"/>
-          <w:color w:val="000000"/>
-        </w:rPr>
-        <w:t xml:space="preserve">Based on the results, </w:t>
+        <w:t xml:space="preserve">The study on the performance of eggplant applied with different methods of Kuhol Amino Acid Application was conducted at [REDACTED], from December 2024 to March 2024 . The Mucho F1 eggplant variety was used as an experimental crop in the study. The experiment was laid out following Randomized Complete Block Design (RCBD) with three replications and four treatments, namely: T1 – Negative Control T2 – Foliar Application of Kuhol Amino Acid; T3 – Drenching Application of Kuhol Amino Acid; T4 – Inorganic Fertilizer (RR). Based on the results, </w:t>
       </w:r>
       <w:r>
         <w:rPr>
@@ -28610,19 +28467,7 @@
           <w:strike w:val="0"/>
           <w:color w:val="000000"/>
         </w:rPr>
-        <w:t xml:space="preserve">The field study was conducted from January 2023 to April 2023 at [REDACTED] to evaluate the performance of rice as supplemented with foliar fertilizer. The experimental design used is a randomized complete block design (RCBD) with three treatments replicated three times. The following treatments were used: T1: recommended rate of NPK based on soil analysis; T2: recommended rate of NPK + 19-19-19; and T3: recommended rate of NPK + 14-14-14. </w:t>
-      </w:r>
-      <w:r>
-        <w:rPr>
-          <w:rFonts w:ascii="Georgia" w:hAnsi="Georgia" w:cs="Georgia" w:eastAsia="Georgia"/>
-          <w:sz w:val="22"/>
-          <w:szCs w:val="22"/>
-          <w:b w:val="0"/>
-          <w:bCs w:val="0"/>
-          <w:strike w:val="0"/>
-          <w:color w:val="000000"/>
-        </w:rPr>
-        <w:t xml:space="preserve">The results of the study revealed the following: </w:t>
+        <w:t xml:space="preserve">The field study was conducted from January 2023 to April 2023 at [REDACTED] to evaluate the performance of rice as supplemented with foliar fertilizer. The experimental design used is a randomized complete block design (RCBD) with three treatments replicated three times. The following treatments were used: T1: recommended rate of NPK based on soil analysis; T2: recommended rate of NPK + 19-19-19; and T3: recommended rate of NPK + 14-14-14. The results of the study revealed the following: </w:t>
       </w:r>
       <w:r>
         <w:rPr>
@@ -28659,19 +28504,7 @@
           <w:strike w:val="0"/>
           <w:color w:val="000000"/>
         </w:rPr>
-        <w:t xml:space="preserve"> No significant differences were observed in terms of the number of days from transplanting to flowering, plant height, number of unproductive tillers, length of panicle, number of filled grains, number of unfilled grains, and weight of 1,000 seeds. </w:t>
-      </w:r>
-      <w:r>
-        <w:rPr>
-          <w:rFonts w:ascii="Georgia" w:hAnsi="Georgia" w:cs="Georgia" w:eastAsia="Georgia"/>
-          <w:sz w:val="22"/>
-          <w:szCs w:val="22"/>
-          <w:b w:val="0"/>
-          <w:bCs w:val="0"/>
-          <w:strike w:val="0"/>
-          <w:color w:val="000000"/>
-        </w:rPr>
-        <w:t xml:space="preserve">In conclusion, </w:t>
+        <w:t xml:space="preserve"> No significant differences were observed in terms of the number of days from transplanting to flowering, plant height, number of unproductive tillers, length of panicle, number of filled grains, number of unfilled grains, and weight of 1,000 seeds. In conclusion, </w:t>
       </w:r>
       <w:r>
         <w:rPr>
@@ -28781,19 +28614,7 @@
           <w:strike w:val="0"/>
           <w:color w:val="000000"/>
         </w:rPr>
-        <w:t xml:space="preserve">The field was conducted for 35 days from April 6, to May 10, 2023 in [REDACTED], [REDACTED] to determine the effect of feeding para grass mixed with varying levels of Gmelina arborea on the growth performance of rabbits. The experimental design used was a randomized complete block design (RCBD) with three treatments replicated three times. The following treatments were used: T1 ([Control] 60% Para grass + 40% Concentrate Feeds), T2 (20% GA Leaves + 40% Para grass + 40% Concentrate Feeds), and T3 (30% GA Leaves + 30% Para grass + 40% Concentrate Feeds). </w:t>
-      </w:r>
-      <w:r>
-        <w:rPr>
-          <w:rFonts w:ascii="Georgia" w:hAnsi="Georgia" w:cs="Georgia" w:eastAsia="Georgia"/>
-          <w:sz w:val="22"/>
-          <w:szCs w:val="22"/>
-          <w:b w:val="0"/>
-          <w:bCs w:val="0"/>
-          <w:strike w:val="0"/>
-          <w:color w:val="000000"/>
-        </w:rPr>
-        <w:t xml:space="preserve">The results of the study revealed the following: </w:t>
+        <w:t xml:space="preserve">The field was conducted for 35 days from April 6, to May 10, 2023 in [REDACTED], [REDACTED] to determine the effect of feeding para grass mixed with varying levels of Gmelina arborea on the growth performance of rabbits. The experimental design used was a randomized complete block design (RCBD) with three treatments replicated three times. The following treatments were used: T1 ([Control] 60% Para grass + 40% Concentrate Feeds), T2 (20% GA Leaves + 40% Para grass + 40% Concentrate Feeds), and T3 (30% GA Leaves + 30% Para grass + 40% Concentrate Feeds). The results of the study revealed the following: </w:t>
       </w:r>
       <w:r>
         <w:rPr>
@@ -28949,19 +28770,7 @@
           <w:strike w:val="0"/>
           <w:color w:val="000000"/>
         </w:rPr>
-        <w:t xml:space="preserve"> </w:t>
-      </w:r>
-      <w:r>
-        <w:rPr>
-          <w:rFonts w:ascii="Georgia" w:hAnsi="Georgia" w:cs="Georgia" w:eastAsia="Georgia"/>
-          <w:sz w:val="22"/>
-          <w:szCs w:val="22"/>
-          <w:b w:val="0"/>
-          <w:bCs w:val="0"/>
-          <w:strike w:val="0"/>
-          <w:color w:val="000000"/>
-        </w:rPr>
-        <w:t xml:space="preserve">Additionally, </w:t>
+        <w:t xml:space="preserve"> Additionally, </w:t>
       </w:r>
       <w:r>
         <w:rPr>
@@ -29423,19 +29232,7 @@
           <w:strike w:val="0"/>
           <w:color w:val="000000"/>
         </w:rPr>
-        <w:t xml:space="preserve">The study examines the germination and growth rate of pigeon pea (Cajanus cajan) under different scarification method for 30 days. The effects of various scarification method, including water in different temperatures, mechanical scarification (sand paper method) and a chemical scarification (sulfuric acid), were assessed through multiple parameters. The study analyzed the germination rate, days to germinate, plant height, length of roots, age to bear leaves, length of leaves, number of leaves, number of branches, mortality, and cost production analysis. The type of scarification method that showed prime results was Treatment 3 (sand paper method). </w:t>
-      </w:r>
-      <w:r>
-        <w:rPr>
-          <w:rFonts w:ascii="Georgia" w:hAnsi="Georgia" w:cs="Georgia" w:eastAsia="Georgia"/>
-          <w:sz w:val="22"/>
-          <w:szCs w:val="22"/>
-          <w:b w:val="0"/>
-          <w:bCs w:val="0"/>
-          <w:strike w:val="0"/>
-          <w:color w:val="000000"/>
-        </w:rPr>
-        <w:t xml:space="preserve">It was found to have </w:t>
+        <w:t xml:space="preserve">The study examines the germination and growth rate of pigeon pea (Cajanus cajan) under different scarification method for 30 days. The effects of various scarification method, including water in different temperatures, mechanical scarification (sand paper method) and a chemical scarification (sulfuric acid), were assessed through multiple parameters. The study analyzed the germination rate, days to germinate, plant height, length of roots, age to bear leaves, length of leaves, number of leaves, number of branches, mortality, and cost production analysis. The type of scarification method that showed prime results was Treatment 3 (sand paper method). It was found to have </w:t>
       </w:r>
       <w:r>
         <w:rPr>
@@ -29851,19 +29648,7 @@
           <w:strike w:val="0"/>
           <w:color w:val="000000"/>
         </w:rPr>
-        <w:t xml:space="preserve">The study was conducted at [REDACTED] from April 25 to April 30, 2023 to find out the [TITLE REDACTED] where a total of nine hundred maggots (900) were used. The experiment was laid out using Complete Randomized Design (CRD) with three (3) treatments, namely, T1 –Carbonated rice hull and saw dust, T2 – Diatomaceous Earth, and T3 –Neem tree extract. The nine hundred maggots were divided into three (3) treatments at one hundred maggots (100) per treatment each treatment was replicated three (3) times with one hundred maggots (100) per replication. </w:t>
-      </w:r>
-      <w:r>
-        <w:rPr>
-          <w:rFonts w:ascii="Georgia" w:hAnsi="Georgia" w:cs="Georgia" w:eastAsia="Georgia"/>
-          <w:sz w:val="22"/>
-          <w:szCs w:val="22"/>
-          <w:b w:val="0"/>
-          <w:bCs w:val="0"/>
-          <w:strike w:val="0"/>
-          <w:color w:val="000000"/>
-        </w:rPr>
-        <w:t xml:space="preserve">The results disclosed that </w:t>
+        <w:t xml:space="preserve">The study was conducted at [REDACTED] from April 25 to April 30, 2023 to find out the [TITLE REDACTED] where a total of nine hundred maggots (900) were used. The experiment was laid out using Complete Randomized Design (CRD) with three (3) treatments, namely, T1 –Carbonated rice hull and saw dust, T2 – Diatomaceous Earth, and T3 –Neem tree extract. The nine hundred maggots were divided into three (3) treatments at one hundred maggots (100) per treatment each treatment was replicated three (3) times with one hundred maggots (100) per replication. The results disclosed that </w:t>
       </w:r>
       <w:r>
         <w:rPr>

</xml_diff>